<commit_message>
Apply three verified fixes from the read-through
Key Messages state the overtime-to-after-hours connection as its mechanism
instead of the abstract 'route' phrase; the Saager sentence names anaesthesia
transitions as the best-studied handover type so the analogy is explicit;
and Pittman 2025 re-enters the staff paragraph with its exact finding
(nursing overtime above a safety threshold associated with more pressure
ulcers), verified against the PubMed record. References renumbered to 27.

Co-Authored-By: Claude Fable 5 <noreply@anthropic.com>
Claude-Session: https://claude.ai/code/session_019Qs9REES3rR8WHYJGTAhnJ
</commit_message>
<xml_diff>
--- a/paper/bmjqs_v2_overtime/Manuscript_v3_final.docx
+++ b/paper/bmjqs_v2_overtime/Manuscript_v3_final.docx
@@ -277,7 +277,7 @@
           <w:sz w:val="24"/>
           <w:szCs w:val="24"/>
         </w:rPr>
-        <w:t xml:space="preserve">After-hours surgery is associated with higher patient mortality, and working overtime is associated with poorer nurse-reported quality and safety of care; overtime is one route by which planned daytime work becomes after-hours work. Overtime is also costly: staffing is planned in advance, so underutilised time is paid staff time that goes unused, and overutilised time costs roughly twice as much per minute. Prior work reports overtime as an aggregate for the whole OR department, which can obscure where it arises.</w:t>
+        <w:t xml:space="preserve">After-hours surgery is associated with higher patient mortality, and working overtime is associated with poorer nurse-reported quality and safety of care. The two are connected: a case that runs past the end of the day shift is completed in the evening, so overtime turns planned daytime surgery into after-hours surgery. Overtime is also costly: staffing is planned in advance, so underutilised time is paid staff time that goes unused, and overutilised time costs roughly twice as much per minute. Prior work reports overtime as an aggregate for the whole OR department, which can obscure where it arises.</w:t>
       </w:r>
     </w:p>
     <w:p>
@@ -440,7 +440,7 @@
           <w:sz w:val="24"/>
           <w:szCs w:val="24"/>
         </w:rPr>
-        <w:t xml:space="preserve"> Handovers carry risk of their own: a case that crosses the shift boundary continues under staff who were not present at its start, and the incidence of major complications rises with each additional intraoperative anaesthesia transition, from 8.8% with none to 21.2% with four or more.</w:t>
+        <w:t xml:space="preserve"> Handovers carry risk of their own: a case that crosses the shift boundary continues under staff who were not present at its start, and for the best-studied type of intraoperative handover, anaesthesia transitions, the incidence of major complications rises from 8.8% with none to 21.2% with four or more.</w:t>
       </w:r>
       <w:r>
         <w:rPr>
@@ -507,6 +507,23 @@
         </w:rPr>
         <w:t xml:space="preserve">7</w:t>
       </w:r>
+      <w:r>
+        <w:rPr>
+          <w:rFonts w:ascii="Times New Roman" w:cs="Times New Roman" w:eastAsia="Times New Roman" w:hAnsi="Times New Roman"/>
+          <w:sz w:val="24"/>
+          <w:szCs w:val="24"/>
+        </w:rPr>
+        <w:t xml:space="preserve"> In 70 US hospitals, nursing overtime above a safety threshold was also associated with more pressure ulcers, one of the safety indicators most sensitive to nursing care.</w:t>
+      </w:r>
+      <w:r>
+        <w:rPr>
+          <w:rFonts w:ascii="Times New Roman" w:cs="Times New Roman" w:eastAsia="Times New Roman" w:hAnsi="Times New Roman"/>
+          <w:sz w:val="24"/>
+          <w:szCs w:val="24"/>
+          <w:vertAlign w:val="superscript"/>
+        </w:rPr>
+        <w:t xml:space="preserve">8</w:t>
+      </w:r>
     </w:p>
     <w:p>
       <w:pPr>
@@ -527,7 +544,7 @@
           <w:szCs w:val="24"/>
           <w:vertAlign w:val="superscript"/>
         </w:rPr>
-        <w:t xml:space="preserve">8</w:t>
+        <w:t xml:space="preserve">9</w:t>
       </w:r>
       <w:r>
         <w:rPr>
@@ -544,7 +561,7 @@
           <w:szCs w:val="24"/>
           <w:vertAlign w:val="superscript"/>
         </w:rPr>
-        <w:t xml:space="preserve">9</w:t>
+        <w:t xml:space="preserve">10</w:t>
       </w:r>
       <w:r>
         <w:rPr>
@@ -561,7 +578,7 @@
           <w:szCs w:val="24"/>
           <w:vertAlign w:val="superscript"/>
         </w:rPr>
-        <w:t xml:space="preserve">10</w:t>
+        <w:t xml:space="preserve">11</w:t>
       </w:r>
       <w:r>
         <w:rPr>
@@ -578,7 +595,7 @@
           <w:szCs w:val="24"/>
           <w:vertAlign w:val="superscript"/>
         </w:rPr>
-        <w:t xml:space="preserve">11</w:t>
+        <w:t xml:space="preserve">12</w:t>
       </w:r>
       <w:r>
         <w:rPr>
@@ -595,7 +612,7 @@
           <w:szCs w:val="24"/>
           <w:vertAlign w:val="superscript"/>
         </w:rPr>
-        <w:t xml:space="preserve">12</w:t>
+        <w:t xml:space="preserve">13</w:t>
       </w:r>
     </w:p>
     <w:p>
@@ -2171,7 +2188,7 @@
           <w:szCs w:val="24"/>
           <w:vertAlign w:val="superscript"/>
         </w:rPr>
-        <w:t xml:space="preserve">12</w:t>
+        <w:t xml:space="preserve">13</w:t>
       </w:r>
       <w:r>
         <w:rPr>
@@ -2218,7 +2235,7 @@
           <w:szCs w:val="24"/>
           <w:vertAlign w:val="superscript"/>
         </w:rPr>
-        <w:t xml:space="preserve">12</w:t>
+        <w:t xml:space="preserve">13</w:t>
       </w:r>
       <w:r>
         <w:rPr>
@@ -2295,6 +2312,23 @@
           <w:szCs w:val="24"/>
           <w:vertAlign w:val="superscript"/>
         </w:rPr>
+        <w:t xml:space="preserve">11</w:t>
+      </w:r>
+      <w:r>
+        <w:rPr>
+          <w:rFonts w:ascii="Times New Roman" w:cs="Times New Roman" w:eastAsia="Times New Roman" w:hAnsi="Times New Roman"/>
+          <w:sz w:val="24"/>
+          <w:szCs w:val="24"/>
+        </w:rPr>
+        <w:t xml:space="preserve"> Because published OR performance metrics lack standardised definitions,</w:t>
+      </w:r>
+      <w:r>
+        <w:rPr>
+          <w:rFonts w:ascii="Times New Roman" w:cs="Times New Roman" w:eastAsia="Times New Roman" w:hAnsi="Times New Roman"/>
+          <w:sz w:val="24"/>
+          <w:szCs w:val="24"/>
+          <w:vertAlign w:val="superscript"/>
+        </w:rPr>
         <w:t xml:space="preserve">10</w:t>
       </w:r>
       <w:r>
@@ -2303,7 +2337,20 @@
           <w:sz w:val="24"/>
           <w:szCs w:val="24"/>
         </w:rPr>
-        <w:t xml:space="preserve"> Because published OR performance metrics lack standardised definitions,</w:t>
+        <w:t xml:space="preserve"> each metric used in this study is defined explicitly.</w:t>
+      </w:r>
+    </w:p>
+    <w:p>
+      <w:pPr>
+        <w:spacing w:after="240" w:line="360"/>
+      </w:pPr>
+      <w:r>
+        <w:rPr>
+          <w:rFonts w:ascii="Times New Roman" w:cs="Times New Roman" w:eastAsia="Times New Roman" w:hAnsi="Times New Roman"/>
+          <w:sz w:val="24"/>
+          <w:szCs w:val="24"/>
+        </w:rPr>
+        <w:t xml:space="preserve">In line with the study’s aim of showing what routinely recorded data can contribute to overtime monitoring, the analyses are descriptive apart from two rank correlations: we report rates, distributions, and shares as observed, we fitted no regression or causal models, and we draw no causal conclusions from the associations reported. For RQ1, we computed the overtime rate, mean, median, and 95th percentile, stratified by room, weekday, year, and shift, together with the split between scheduled crossings and unplanned overruns. For RQ2, we examined duration deviation by planned-duration bucket using the coefficient of variation, defined as the standard deviation of duration divided by its mean, which places cases of different lengths on a comparable scale.</w:t>
       </w:r>
       <w:r>
         <w:rPr>
@@ -2312,37 +2359,7 @@
           <w:szCs w:val="24"/>
           <w:vertAlign w:val="superscript"/>
         </w:rPr>
-        <w:t xml:space="preserve">9</w:t>
-      </w:r>
-      <w:r>
-        <w:rPr>
-          <w:rFonts w:ascii="Times New Roman" w:cs="Times New Roman" w:eastAsia="Times New Roman" w:hAnsi="Times New Roman"/>
-          <w:sz w:val="24"/>
-          <w:szCs w:val="24"/>
-        </w:rPr>
-        <w:t xml:space="preserve"> each metric used in this study is defined explicitly.</w:t>
-      </w:r>
-    </w:p>
-    <w:p>
-      <w:pPr>
-        <w:spacing w:after="240" w:line="360"/>
-      </w:pPr>
-      <w:r>
-        <w:rPr>
-          <w:rFonts w:ascii="Times New Roman" w:cs="Times New Roman" w:eastAsia="Times New Roman" w:hAnsi="Times New Roman"/>
-          <w:sz w:val="24"/>
-          <w:szCs w:val="24"/>
-        </w:rPr>
-        <w:t xml:space="preserve">In line with the study’s aim of showing what routinely recorded data can contribute to overtime monitoring, the analyses are descriptive apart from two rank correlations: we report rates, distributions, and shares as observed, we fitted no regression or causal models, and we draw no causal conclusions from the associations reported. For RQ1, we computed the overtime rate, mean, median, and 95th percentile, stratified by room, weekday, year, and shift, together with the split between scheduled crossings and unplanned overruns. For RQ2, we examined duration deviation by planned-duration bucket using the coefficient of variation, defined as the standard deviation of duration divided by its mean, which places cases of different lengths on a comparable scale.</w:t>
-      </w:r>
-      <w:r>
-        <w:rPr>
-          <w:rFonts w:ascii="Times New Roman" w:cs="Times New Roman" w:eastAsia="Times New Roman" w:hAnsi="Times New Roman"/>
-          <w:sz w:val="24"/>
-          <w:szCs w:val="24"/>
-          <w:vertAlign w:val="superscript"/>
-        </w:rPr>
-        <w:t xml:space="preserve">1,13</w:t>
+        <w:t xml:space="preserve">1,14</w:t>
       </w:r>
       <w:r>
         <w:rPr>
@@ -3690,7 +3707,7 @@
           <w:szCs w:val="24"/>
           <w:vertAlign w:val="superscript"/>
         </w:rPr>
-        <w:t xml:space="preserve">14</w:t>
+        <w:t xml:space="preserve">15</w:t>
       </w:r>
       <w:r>
         <w:rPr>
@@ -3836,7 +3853,7 @@
           <w:szCs w:val="24"/>
           <w:vertAlign w:val="superscript"/>
         </w:rPr>
-        <w:t xml:space="preserve">11</w:t>
+        <w:t xml:space="preserve">12</w:t>
       </w:r>
       <w:r>
         <w:rPr>
@@ -3883,7 +3900,7 @@
           <w:szCs w:val="24"/>
           <w:vertAlign w:val="superscript"/>
         </w:rPr>
-        <w:t xml:space="preserve">15</w:t>
+        <w:t xml:space="preserve">16</w:t>
       </w:r>
       <w:r>
         <w:rPr>
@@ -3900,7 +3917,7 @@
           <w:szCs w:val="24"/>
           <w:vertAlign w:val="superscript"/>
         </w:rPr>
-        <w:t xml:space="preserve">16</w:t>
+        <w:t xml:space="preserve">17</w:t>
       </w:r>
       <w:r>
         <w:rPr>
@@ -3930,7 +3947,7 @@
           <w:szCs w:val="24"/>
           <w:vertAlign w:val="superscript"/>
         </w:rPr>
-        <w:t xml:space="preserve">17</w:t>
+        <w:t xml:space="preserve">18</w:t>
       </w:r>
       <w:r>
         <w:rPr>
@@ -3947,7 +3964,7 @@
           <w:szCs w:val="24"/>
           <w:vertAlign w:val="superscript"/>
         </w:rPr>
-        <w:t xml:space="preserve">18</w:t>
+        <w:t xml:space="preserve">19</w:t>
       </w:r>
       <w:r>
         <w:rPr>
@@ -3990,7 +4007,7 @@
           <w:szCs w:val="24"/>
           <w:vertAlign w:val="superscript"/>
         </w:rPr>
-        <w:t xml:space="preserve">19</w:t>
+        <w:t xml:space="preserve">20</w:t>
       </w:r>
     </w:p>
     <w:p>
@@ -4029,7 +4046,7 @@
           <w:szCs w:val="24"/>
           <w:vertAlign w:val="superscript"/>
         </w:rPr>
-        <w:t xml:space="preserve">10</w:t>
+        <w:t xml:space="preserve">11</w:t>
       </w:r>
       <w:r>
         <w:rPr>
@@ -4046,7 +4063,7 @@
           <w:szCs w:val="24"/>
           <w:vertAlign w:val="superscript"/>
         </w:rPr>
-        <w:t xml:space="preserve">20</w:t>
+        <w:t xml:space="preserve">21</w:t>
       </w:r>
       <w:r>
         <w:rPr>
@@ -4063,7 +4080,7 @@
           <w:szCs w:val="24"/>
           <w:vertAlign w:val="superscript"/>
         </w:rPr>
-        <w:t xml:space="preserve">21</w:t>
+        <w:t xml:space="preserve">22</w:t>
       </w:r>
       <w:r>
         <w:rPr>
@@ -4080,7 +4097,7 @@
           <w:szCs w:val="24"/>
           <w:vertAlign w:val="superscript"/>
         </w:rPr>
-        <w:t xml:space="preserve">22</w:t>
+        <w:t xml:space="preserve">23</w:t>
       </w:r>
       <w:r>
         <w:rPr>
@@ -4097,7 +4114,7 @@
           <w:szCs w:val="24"/>
           <w:vertAlign w:val="superscript"/>
         </w:rPr>
-        <w:t xml:space="preserve">23</w:t>
+        <w:t xml:space="preserve">24</w:t>
       </w:r>
     </w:p>
     <w:p>
@@ -4136,7 +4153,7 @@
           <w:szCs w:val="24"/>
           <w:vertAlign w:val="superscript"/>
         </w:rPr>
-        <w:t xml:space="preserve">24-26</w:t>
+        <w:t xml:space="preserve">25-27</w:t>
       </w:r>
       <w:r>
         <w:rPr>
@@ -4415,241 +4432,254 @@
           <w:sz w:val="24"/>
           <w:szCs w:val="24"/>
         </w:rPr>
-        <w:t xml:space="preserve">8. Macario A. Are your hospital operating rooms "efficient"? A scoring system with eight performance indicators. Anesthesiology 2006;105(2):237-40.</w:t>
-      </w:r>
-    </w:p>
-    <w:p>
-      <w:pPr>
-        <w:spacing w:after="240" w:line="360"/>
-      </w:pPr>
-      <w:r>
-        <w:rPr>
-          <w:rFonts w:ascii="Times New Roman" w:cs="Times New Roman" w:eastAsia="Times New Roman" w:hAnsi="Times New Roman"/>
-          <w:sz w:val="24"/>
-          <w:szCs w:val="24"/>
-        </w:rPr>
-        <w:t xml:space="preserve">9. Schouten AM, Flipse SM, van Nieuwenhuizen KE, et al. Operating room performance optimization metrics: a systematic review. J Med Syst 2023;47(1):19.</w:t>
-      </w:r>
-    </w:p>
-    <w:p>
-      <w:pPr>
-        <w:spacing w:after="240" w:line="360"/>
-      </w:pPr>
-      <w:r>
-        <w:rPr>
-          <w:rFonts w:ascii="Times New Roman" w:cs="Times New Roman" w:eastAsia="Times New Roman" w:hAnsi="Times New Roman"/>
-          <w:sz w:val="24"/>
-          <w:szCs w:val="24"/>
-        </w:rPr>
-        <w:t xml:space="preserve">10. Zhang C, Dunstan C, Pandit JJ. A tutorial on "capped utilisation" as a metric and key performance target in NHS England’s Model Hospital operating theatres database: caution for international healthcare systems. Anesthesiol Perioper Sci 2024. DOI: 10.1007/s44254-024-00073-3.</w:t>
-      </w:r>
-    </w:p>
-    <w:p>
-      <w:pPr>
-        <w:spacing w:after="240" w:line="360"/>
-      </w:pPr>
-      <w:r>
-        <w:rPr>
-          <w:rFonts w:ascii="Times New Roman" w:cs="Times New Roman" w:eastAsia="Times New Roman" w:hAnsi="Times New Roman"/>
-          <w:sz w:val="24"/>
-          <w:szCs w:val="24"/>
-        </w:rPr>
-        <w:t xml:space="preserve">11. Wachtel RE, Dexter F. Review of behavioral operations experimental studies of newsvendor problems for operating room management. Anesth Analg 2010;110(6):1698-710.</w:t>
-      </w:r>
-    </w:p>
-    <w:p>
-      <w:pPr>
-        <w:spacing w:after="240" w:line="360"/>
-      </w:pPr>
-      <w:r>
-        <w:rPr>
-          <w:rFonts w:ascii="Times New Roman" w:cs="Times New Roman" w:eastAsia="Times New Roman" w:hAnsi="Times New Roman"/>
-          <w:sz w:val="24"/>
-          <w:szCs w:val="24"/>
-        </w:rPr>
-        <w:t xml:space="preserve">12. Bauer M, Auhuber TC, Kraus R, et al. The German perioperative procedural time glossary: a joint recommendation by the BDA, BDC, VOPM, VOPMÖ, ÖGARI and SFOPM (2020 edition). Anästh Intensivmed 2020;61:516-31. DOI: 10.19224/ai2020.516.</w:t>
-      </w:r>
-    </w:p>
-    <w:p>
-      <w:pPr>
-        <w:spacing w:after="240" w:line="360"/>
-      </w:pPr>
-      <w:r>
-        <w:rPr>
-          <w:rFonts w:ascii="Times New Roman" w:cs="Times New Roman" w:eastAsia="Times New Roman" w:hAnsi="Times New Roman"/>
-          <w:sz w:val="24"/>
-          <w:szCs w:val="24"/>
-        </w:rPr>
-        <w:t xml:space="preserve">13. Eijkemans MJ, van Houdenhoven M, Nguyen T, et al. Predicting the unpredictable: a new prediction model for operating room times using individual characteristics and the surgeon's estimate. Anesthesiology 2010;112(1):41-9.</w:t>
-      </w:r>
-    </w:p>
-    <w:p>
-      <w:pPr>
-        <w:spacing w:after="240" w:line="360"/>
-      </w:pPr>
-      <w:r>
-        <w:rPr>
-          <w:rFonts w:ascii="Times New Roman" w:cs="Times New Roman" w:eastAsia="Times New Roman" w:hAnsi="Times New Roman"/>
-          <w:sz w:val="24"/>
-          <w:szCs w:val="24"/>
-        </w:rPr>
-        <w:t xml:space="preserve">14. MacMillan L, Madura GM, Elliot M, et al. What affects operating room turnover time? A systematic review and mapping of the evidence. Surgery 2025;181:109263.</w:t>
-      </w:r>
-    </w:p>
-    <w:p>
-      <w:pPr>
-        <w:spacing w:after="240" w:line="360"/>
-      </w:pPr>
-      <w:r>
-        <w:rPr>
-          <w:rFonts w:ascii="Times New Roman" w:cs="Times New Roman" w:eastAsia="Times New Roman" w:hAnsi="Times New Roman"/>
-          <w:sz w:val="24"/>
-          <w:szCs w:val="24"/>
-        </w:rPr>
-        <w:t xml:space="preserve">15. Fügener A, Schiffels S, Kolisch R. Overutilization and underutilization of operating rooms: insights from behavioral health care operations management. Health Care Manag Sci 2017;20(1):115-28.</w:t>
-      </w:r>
-    </w:p>
-    <w:p>
-      <w:pPr>
-        <w:spacing w:after="240" w:line="360"/>
-      </w:pPr>
-      <w:r>
-        <w:rPr>
-          <w:rFonts w:ascii="Times New Roman" w:cs="Times New Roman" w:eastAsia="Times New Roman" w:hAnsi="Times New Roman"/>
-          <w:sz w:val="24"/>
-          <w:szCs w:val="24"/>
-        </w:rPr>
-        <w:t xml:space="preserve">16. Wachtel RE, Dexter F. Influence of the operating room schedule on tardiness from scheduled start times. Anesth Analg 2009;108(6):1889-901.</w:t>
-      </w:r>
-    </w:p>
-    <w:p>
-      <w:pPr>
-        <w:spacing w:after="240" w:line="360"/>
-      </w:pPr>
-      <w:r>
-        <w:rPr>
-          <w:rFonts w:ascii="Times New Roman" w:cs="Times New Roman" w:eastAsia="Times New Roman" w:hAnsi="Times New Roman"/>
-          <w:sz w:val="24"/>
-          <w:szCs w:val="24"/>
-        </w:rPr>
-        <w:t xml:space="preserve">17. Dexter F, Epstein RH. Typical savings from each minute reduction in tardy first case of the day starts. Anesth Analg 2009;108(4):1262-7.</w:t>
-      </w:r>
-    </w:p>
-    <w:p>
-      <w:pPr>
-        <w:spacing w:after="240" w:line="360"/>
-      </w:pPr>
-      <w:r>
-        <w:rPr>
-          <w:rFonts w:ascii="Times New Roman" w:cs="Times New Roman" w:eastAsia="Times New Roman" w:hAnsi="Times New Roman"/>
-          <w:sz w:val="24"/>
-          <w:szCs w:val="24"/>
-        </w:rPr>
-        <w:t xml:space="preserve">18. Pandit JJ, Abbott T, Pandit M, et al. Is "starting on time" useful (or useless) as a surrogate measure for "surgical theatre efficiency"? Anaesthesia 2012;67(8):823-32.</w:t>
-      </w:r>
-    </w:p>
-    <w:p>
-      <w:pPr>
-        <w:spacing w:after="240" w:line="360"/>
-      </w:pPr>
-      <w:r>
-        <w:rPr>
-          <w:rFonts w:ascii="Times New Roman" w:cs="Times New Roman" w:eastAsia="Times New Roman" w:hAnsi="Times New Roman"/>
-          <w:sz w:val="24"/>
-          <w:szCs w:val="24"/>
-        </w:rPr>
-        <w:t xml:space="preserve">19. Parmar D, Woodman M, Pandit JJ. A graphical assessment of emergency surgical list efficiency to determine operating theatre capacity needs. Br J Anaesth 2022;128(3):574-83.</w:t>
-      </w:r>
-    </w:p>
-    <w:p>
-      <w:pPr>
-        <w:spacing w:after="240" w:line="360"/>
-      </w:pPr>
-      <w:r>
-        <w:rPr>
-          <w:rFonts w:ascii="Times New Roman" w:cs="Times New Roman" w:eastAsia="Times New Roman" w:hAnsi="Times New Roman"/>
-          <w:sz w:val="24"/>
-          <w:szCs w:val="24"/>
-        </w:rPr>
-        <w:t xml:space="preserve">20. Charlesworth M, Pandit JJ. Rational performance metrics for operating theatres, principles of efficiency, and how to achieve it. Br J Surg 2020;107(2):e63-9.</w:t>
-      </w:r>
-    </w:p>
-    <w:p>
-      <w:pPr>
-        <w:spacing w:after="240" w:line="360"/>
-      </w:pPr>
-      <w:r>
-        <w:rPr>
-          <w:rFonts w:ascii="Times New Roman" w:cs="Times New Roman" w:eastAsia="Times New Roman" w:hAnsi="Times New Roman"/>
-          <w:sz w:val="24"/>
-          <w:szCs w:val="24"/>
-        </w:rPr>
-        <w:t xml:space="preserve">21. Zhang C, Pandit JJ. Getting operating theatre metrics right to underpin quality improvement. Br J Anaesth 2023;131(1):130-4.</w:t>
-      </w:r>
-    </w:p>
-    <w:p>
-      <w:pPr>
-        <w:spacing w:after="240" w:line="360"/>
-      </w:pPr>
-      <w:r>
-        <w:rPr>
-          <w:rFonts w:ascii="Times New Roman" w:cs="Times New Roman" w:eastAsia="Times New Roman" w:hAnsi="Times New Roman"/>
-          <w:sz w:val="24"/>
-          <w:szCs w:val="24"/>
-        </w:rPr>
-        <w:t xml:space="preserve">22. Dexter F, Wachtel RE, Epstein RH. Decreasing the hours that anesthesiologists and nurse anesthetists work late by making decisions to reduce the hours of over-utilized operating room time. Anesth Analg 2016;122(3):831-42.</w:t>
-      </w:r>
-    </w:p>
-    <w:p>
-      <w:pPr>
-        <w:spacing w:after="240" w:line="360"/>
-      </w:pPr>
-      <w:r>
-        <w:rPr>
-          <w:rFonts w:ascii="Times New Roman" w:cs="Times New Roman" w:eastAsia="Times New Roman" w:hAnsi="Times New Roman"/>
-          <w:sz w:val="24"/>
-          <w:szCs w:val="24"/>
-        </w:rPr>
-        <w:t xml:space="preserve">23. Ivers N, Jamtvedt G, Flottorp S, et al. Audit and feedback: effects on professional practice and healthcare outcomes. Cochrane Database Syst Rev 2012;(6):CD000259.</w:t>
-      </w:r>
-    </w:p>
-    <w:p>
-      <w:pPr>
-        <w:spacing w:after="240" w:line="360"/>
-      </w:pPr>
-      <w:r>
-        <w:rPr>
-          <w:rFonts w:ascii="Times New Roman" w:cs="Times New Roman" w:eastAsia="Times New Roman" w:hAnsi="Times New Roman"/>
-          <w:sz w:val="24"/>
-          <w:szCs w:val="24"/>
-        </w:rPr>
-        <w:t xml:space="preserve">24. Oh T-K, Song I-A. Outcomes of after-hours surgeries performed under general anaesthesia: a South Korean nationwide cohort study. Anaesthesia 2025;80(6):645-51.</w:t>
-      </w:r>
-    </w:p>
-    <w:p>
-      <w:pPr>
-        <w:spacing w:after="240" w:line="360"/>
-      </w:pPr>
-      <w:r>
-        <w:rPr>
-          <w:rFonts w:ascii="Times New Roman" w:cs="Times New Roman" w:eastAsia="Times New Roman" w:hAnsi="Times New Roman"/>
-          <w:sz w:val="24"/>
-          <w:szCs w:val="24"/>
-        </w:rPr>
-        <w:t xml:space="preserve">25. Sakurai K, Takeda C. Assessing the influence of after-hours surgery: concerns with the confounders and conclusion. Anaesthesia 2025;80(5):596-7.</w:t>
-      </w:r>
-    </w:p>
-    <w:p>
-      <w:pPr>
-        <w:spacing w:after="240" w:line="360"/>
-      </w:pPr>
-      <w:r>
-        <w:rPr>
-          <w:rFonts w:ascii="Times New Roman" w:cs="Times New Roman" w:eastAsia="Times New Roman" w:hAnsi="Times New Roman"/>
-          <w:sz w:val="24"/>
-          <w:szCs w:val="24"/>
-        </w:rPr>
-        <w:t xml:space="preserve">26. Meewisse AJG, Gribnau A, Thiessen SE, et al. Effect of time of day on outcomes in elective surgery: a systematic review. Anaesthesia 2024;79(12):1325-34.</w:t>
+        <w:t xml:space="preserve">8. Pittman P, Tiunn HL, Luo Q, et al. Increased utilization of overtime and agency nurses and patient safety. JAMA Netw Open 2025;8(4):e252875.</w:t>
+      </w:r>
+    </w:p>
+    <w:p>
+      <w:pPr>
+        <w:spacing w:after="240" w:line="360"/>
+      </w:pPr>
+      <w:r>
+        <w:rPr>
+          <w:rFonts w:ascii="Times New Roman" w:cs="Times New Roman" w:eastAsia="Times New Roman" w:hAnsi="Times New Roman"/>
+          <w:sz w:val="24"/>
+          <w:szCs w:val="24"/>
+        </w:rPr>
+        <w:t xml:space="preserve">9. Macario A. Are your hospital operating rooms "efficient"? A scoring system with eight performance indicators. Anesthesiology 2006;105(2):237-40.</w:t>
+      </w:r>
+    </w:p>
+    <w:p>
+      <w:pPr>
+        <w:spacing w:after="240" w:line="360"/>
+      </w:pPr>
+      <w:r>
+        <w:rPr>
+          <w:rFonts w:ascii="Times New Roman" w:cs="Times New Roman" w:eastAsia="Times New Roman" w:hAnsi="Times New Roman"/>
+          <w:sz w:val="24"/>
+          <w:szCs w:val="24"/>
+        </w:rPr>
+        <w:t xml:space="preserve">10. Schouten AM, Flipse SM, van Nieuwenhuizen KE, et al. Operating room performance optimization metrics: a systematic review. J Med Syst 2023;47(1):19.</w:t>
+      </w:r>
+    </w:p>
+    <w:p>
+      <w:pPr>
+        <w:spacing w:after="240" w:line="360"/>
+      </w:pPr>
+      <w:r>
+        <w:rPr>
+          <w:rFonts w:ascii="Times New Roman" w:cs="Times New Roman" w:eastAsia="Times New Roman" w:hAnsi="Times New Roman"/>
+          <w:sz w:val="24"/>
+          <w:szCs w:val="24"/>
+        </w:rPr>
+        <w:t xml:space="preserve">11. Zhang C, Dunstan C, Pandit JJ. A tutorial on "capped utilisation" as a metric and key performance target in NHS England’s Model Hospital operating theatres database: caution for international healthcare systems. Anesthesiol Perioper Sci 2024. DOI: 10.1007/s44254-024-00073-3.</w:t>
+      </w:r>
+    </w:p>
+    <w:p>
+      <w:pPr>
+        <w:spacing w:after="240" w:line="360"/>
+      </w:pPr>
+      <w:r>
+        <w:rPr>
+          <w:rFonts w:ascii="Times New Roman" w:cs="Times New Roman" w:eastAsia="Times New Roman" w:hAnsi="Times New Roman"/>
+          <w:sz w:val="24"/>
+          <w:szCs w:val="24"/>
+        </w:rPr>
+        <w:t xml:space="preserve">12. Wachtel RE, Dexter F. Review of behavioral operations experimental studies of newsvendor problems for operating room management. Anesth Analg 2010;110(6):1698-710.</w:t>
+      </w:r>
+    </w:p>
+    <w:p>
+      <w:pPr>
+        <w:spacing w:after="240" w:line="360"/>
+      </w:pPr>
+      <w:r>
+        <w:rPr>
+          <w:rFonts w:ascii="Times New Roman" w:cs="Times New Roman" w:eastAsia="Times New Roman" w:hAnsi="Times New Roman"/>
+          <w:sz w:val="24"/>
+          <w:szCs w:val="24"/>
+        </w:rPr>
+        <w:t xml:space="preserve">13. Bauer M, Auhuber TC, Kraus R, et al. The German perioperative procedural time glossary: a joint recommendation by the BDA, BDC, VOPM, VOPMÖ, ÖGARI and SFOPM (2020 edition). Anästh Intensivmed 2020;61:516-31. DOI: 10.19224/ai2020.516.</w:t>
+      </w:r>
+    </w:p>
+    <w:p>
+      <w:pPr>
+        <w:spacing w:after="240" w:line="360"/>
+      </w:pPr>
+      <w:r>
+        <w:rPr>
+          <w:rFonts w:ascii="Times New Roman" w:cs="Times New Roman" w:eastAsia="Times New Roman" w:hAnsi="Times New Roman"/>
+          <w:sz w:val="24"/>
+          <w:szCs w:val="24"/>
+        </w:rPr>
+        <w:t xml:space="preserve">14. Eijkemans MJ, van Houdenhoven M, Nguyen T, et al. Predicting the unpredictable: a new prediction model for operating room times using individual characteristics and the surgeon's estimate. Anesthesiology 2010;112(1):41-9.</w:t>
+      </w:r>
+    </w:p>
+    <w:p>
+      <w:pPr>
+        <w:spacing w:after="240" w:line="360"/>
+      </w:pPr>
+      <w:r>
+        <w:rPr>
+          <w:rFonts w:ascii="Times New Roman" w:cs="Times New Roman" w:eastAsia="Times New Roman" w:hAnsi="Times New Roman"/>
+          <w:sz w:val="24"/>
+          <w:szCs w:val="24"/>
+        </w:rPr>
+        <w:t xml:space="preserve">15. MacMillan L, Madura GM, Elliot M, et al. What affects operating room turnover time? A systematic review and mapping of the evidence. Surgery 2025;181:109263.</w:t>
+      </w:r>
+    </w:p>
+    <w:p>
+      <w:pPr>
+        <w:spacing w:after="240" w:line="360"/>
+      </w:pPr>
+      <w:r>
+        <w:rPr>
+          <w:rFonts w:ascii="Times New Roman" w:cs="Times New Roman" w:eastAsia="Times New Roman" w:hAnsi="Times New Roman"/>
+          <w:sz w:val="24"/>
+          <w:szCs w:val="24"/>
+        </w:rPr>
+        <w:t xml:space="preserve">16. Fügener A, Schiffels S, Kolisch R. Overutilization and underutilization of operating rooms: insights from behavioral health care operations management. Health Care Manag Sci 2017;20(1):115-28.</w:t>
+      </w:r>
+    </w:p>
+    <w:p>
+      <w:pPr>
+        <w:spacing w:after="240" w:line="360"/>
+      </w:pPr>
+      <w:r>
+        <w:rPr>
+          <w:rFonts w:ascii="Times New Roman" w:cs="Times New Roman" w:eastAsia="Times New Roman" w:hAnsi="Times New Roman"/>
+          <w:sz w:val="24"/>
+          <w:szCs w:val="24"/>
+        </w:rPr>
+        <w:t xml:space="preserve">17. Wachtel RE, Dexter F. Influence of the operating room schedule on tardiness from scheduled start times. Anesth Analg 2009;108(6):1889-901.</w:t>
+      </w:r>
+    </w:p>
+    <w:p>
+      <w:pPr>
+        <w:spacing w:after="240" w:line="360"/>
+      </w:pPr>
+      <w:r>
+        <w:rPr>
+          <w:rFonts w:ascii="Times New Roman" w:cs="Times New Roman" w:eastAsia="Times New Roman" w:hAnsi="Times New Roman"/>
+          <w:sz w:val="24"/>
+          <w:szCs w:val="24"/>
+        </w:rPr>
+        <w:t xml:space="preserve">18. Dexter F, Epstein RH. Typical savings from each minute reduction in tardy first case of the day starts. Anesth Analg 2009;108(4):1262-7.</w:t>
+      </w:r>
+    </w:p>
+    <w:p>
+      <w:pPr>
+        <w:spacing w:after="240" w:line="360"/>
+      </w:pPr>
+      <w:r>
+        <w:rPr>
+          <w:rFonts w:ascii="Times New Roman" w:cs="Times New Roman" w:eastAsia="Times New Roman" w:hAnsi="Times New Roman"/>
+          <w:sz w:val="24"/>
+          <w:szCs w:val="24"/>
+        </w:rPr>
+        <w:t xml:space="preserve">19. Pandit JJ, Abbott T, Pandit M, et al. Is "starting on time" useful (or useless) as a surrogate measure for "surgical theatre efficiency"? Anaesthesia 2012;67(8):823-32.</w:t>
+      </w:r>
+    </w:p>
+    <w:p>
+      <w:pPr>
+        <w:spacing w:after="240" w:line="360"/>
+      </w:pPr>
+      <w:r>
+        <w:rPr>
+          <w:rFonts w:ascii="Times New Roman" w:cs="Times New Roman" w:eastAsia="Times New Roman" w:hAnsi="Times New Roman"/>
+          <w:sz w:val="24"/>
+          <w:szCs w:val="24"/>
+        </w:rPr>
+        <w:t xml:space="preserve">20. Parmar D, Woodman M, Pandit JJ. A graphical assessment of emergency surgical list efficiency to determine operating theatre capacity needs. Br J Anaesth 2022;128(3):574-83.</w:t>
+      </w:r>
+    </w:p>
+    <w:p>
+      <w:pPr>
+        <w:spacing w:after="240" w:line="360"/>
+      </w:pPr>
+      <w:r>
+        <w:rPr>
+          <w:rFonts w:ascii="Times New Roman" w:cs="Times New Roman" w:eastAsia="Times New Roman" w:hAnsi="Times New Roman"/>
+          <w:sz w:val="24"/>
+          <w:szCs w:val="24"/>
+        </w:rPr>
+        <w:t xml:space="preserve">21. Charlesworth M, Pandit JJ. Rational performance metrics for operating theatres, principles of efficiency, and how to achieve it. Br J Surg 2020;107(2):e63-9.</w:t>
+      </w:r>
+    </w:p>
+    <w:p>
+      <w:pPr>
+        <w:spacing w:after="240" w:line="360"/>
+      </w:pPr>
+      <w:r>
+        <w:rPr>
+          <w:rFonts w:ascii="Times New Roman" w:cs="Times New Roman" w:eastAsia="Times New Roman" w:hAnsi="Times New Roman"/>
+          <w:sz w:val="24"/>
+          <w:szCs w:val="24"/>
+        </w:rPr>
+        <w:t xml:space="preserve">22. Zhang C, Pandit JJ. Getting operating theatre metrics right to underpin quality improvement. Br J Anaesth 2023;131(1):130-4.</w:t>
+      </w:r>
+    </w:p>
+    <w:p>
+      <w:pPr>
+        <w:spacing w:after="240" w:line="360"/>
+      </w:pPr>
+      <w:r>
+        <w:rPr>
+          <w:rFonts w:ascii="Times New Roman" w:cs="Times New Roman" w:eastAsia="Times New Roman" w:hAnsi="Times New Roman"/>
+          <w:sz w:val="24"/>
+          <w:szCs w:val="24"/>
+        </w:rPr>
+        <w:t xml:space="preserve">23. Dexter F, Wachtel RE, Epstein RH. Decreasing the hours that anesthesiologists and nurse anesthetists work late by making decisions to reduce the hours of over-utilized operating room time. Anesth Analg 2016;122(3):831-42.</w:t>
+      </w:r>
+    </w:p>
+    <w:p>
+      <w:pPr>
+        <w:spacing w:after="240" w:line="360"/>
+      </w:pPr>
+      <w:r>
+        <w:rPr>
+          <w:rFonts w:ascii="Times New Roman" w:cs="Times New Roman" w:eastAsia="Times New Roman" w:hAnsi="Times New Roman"/>
+          <w:sz w:val="24"/>
+          <w:szCs w:val="24"/>
+        </w:rPr>
+        <w:t xml:space="preserve">24. Ivers N, Jamtvedt G, Flottorp S, et al. Audit and feedback: effects on professional practice and healthcare outcomes. Cochrane Database Syst Rev 2012;(6):CD000259.</w:t>
+      </w:r>
+    </w:p>
+    <w:p>
+      <w:pPr>
+        <w:spacing w:after="240" w:line="360"/>
+      </w:pPr>
+      <w:r>
+        <w:rPr>
+          <w:rFonts w:ascii="Times New Roman" w:cs="Times New Roman" w:eastAsia="Times New Roman" w:hAnsi="Times New Roman"/>
+          <w:sz w:val="24"/>
+          <w:szCs w:val="24"/>
+        </w:rPr>
+        <w:t xml:space="preserve">25. Oh T-K, Song I-A. Outcomes of after-hours surgeries performed under general anaesthesia: a South Korean nationwide cohort study. Anaesthesia 2025;80(6):645-51.</w:t>
+      </w:r>
+    </w:p>
+    <w:p>
+      <w:pPr>
+        <w:spacing w:after="240" w:line="360"/>
+      </w:pPr>
+      <w:r>
+        <w:rPr>
+          <w:rFonts w:ascii="Times New Roman" w:cs="Times New Roman" w:eastAsia="Times New Roman" w:hAnsi="Times New Roman"/>
+          <w:sz w:val="24"/>
+          <w:szCs w:val="24"/>
+        </w:rPr>
+        <w:t xml:space="preserve">26. Sakurai K, Takeda C. Assessing the influence of after-hours surgery: concerns with the confounders and conclusion. Anaesthesia 2025;80(5):596-7.</w:t>
+      </w:r>
+    </w:p>
+    <w:p>
+      <w:pPr>
+        <w:spacing w:after="240" w:line="360"/>
+      </w:pPr>
+      <w:r>
+        <w:rPr>
+          <w:rFonts w:ascii="Times New Roman" w:cs="Times New Roman" w:eastAsia="Times New Roman" w:hAnsi="Times New Roman"/>
+          <w:sz w:val="24"/>
+          <w:szCs w:val="24"/>
+        </w:rPr>
+        <w:t xml:space="preserve">27. Meewisse AJG, Gribnau A, Thiessen SE, et al. Effect of time of day on outcomes in elective surgery: a systematic review. Anaesthesia 2024;79(12):1325-34.</w:t>
       </w:r>
     </w:p>
     <w:sectPr>

</xml_diff>

<commit_message>
Cite the FCOTS assumption in Results and correct two reference entries
The punctuality opener now carries Dexter and Epstein plus Pandit at the
assumption it tests, moving their first citations into Results and
renumbering references 15 to 19; the Ivers entry gains its volume and the
Zhang 2024 entry its volume and article number, both verified at source.

Co-Authored-By: Claude Fable 5 <noreply@anthropic.com>
Claude-Session: https://claude.ai/code/session_019Qs9REES3rR8WHYJGTAhnJ
</commit_message>
<xml_diff>
--- a/paper/bmjqs_v2_overtime/Manuscript_v3_final.docx
+++ b/paper/bmjqs_v2_overtime/Manuscript_v3_final.docx
@@ -3675,7 +3675,24 @@
           <w:sz w:val="24"/>
           <w:szCs w:val="24"/>
         </w:rPr>
-        <w:t xml:space="preserve">A common assumption in OR management is that punctual starts, and the first case of the day in particular (first-case on-time start, FCOTS), keep a list on schedule so that it finishes within its shift. Late starts were common: 67.4% of cases started after their planned time, by a mean of 74.6 minutes and a median of 28 minutes among late cases. To test the assumption, we correlated each room’s late-start rate with its overtime rate. Across the 18 rooms there was no association (Spearman rho = −0.29, p = 0.24). Figure 2 (panel B) shows why: the rooms form a cloud with no gradient, and the extremes run against the assumption, with OR10 combining the lowest late-start rate with the highest overtime rate and OR14 starting late most often while running the least overtime. Start-time punctuality therefore does not indicate which rooms accumulate overtime.</w:t>
+        <w:t xml:space="preserve">A common assumption in OR management is that punctual starts, and the first case of the day in particular (first-case on-time start, FCOTS), keep a list on schedule so that it finishes within its shift.</w:t>
+      </w:r>
+      <w:r>
+        <w:rPr>
+          <w:rFonts w:ascii="Times New Roman" w:cs="Times New Roman" w:eastAsia="Times New Roman" w:hAnsi="Times New Roman"/>
+          <w:sz w:val="24"/>
+          <w:szCs w:val="24"/>
+          <w:vertAlign w:val="superscript"/>
+        </w:rPr>
+        <w:t xml:space="preserve">15,16</w:t>
+      </w:r>
+      <w:r>
+        <w:rPr>
+          <w:rFonts w:ascii="Times New Roman" w:cs="Times New Roman" w:eastAsia="Times New Roman" w:hAnsi="Times New Roman"/>
+          <w:sz w:val="24"/>
+          <w:szCs w:val="24"/>
+        </w:rPr>
+        <w:t xml:space="preserve"> Late starts were common: 67.4% of cases started after their planned time, by a mean of 74.6 minutes and a median of 28 minutes among late cases. To test the assumption, we correlated each room’s late-start rate with its overtime rate. Across the 18 rooms there was no association (Spearman rho = −0.29, p = 0.24). Figure 2 (panel B) shows why: the rooms form a cloud with no gradient, and the extremes run against the assumption, with OR10 combining the lowest late-start rate with the highest overtime rate and OR14 starting late most often while running the least overtime. Start-time punctuality therefore does not indicate which rooms accumulate overtime.</w:t>
       </w:r>
     </w:p>
     <w:p>
@@ -3707,7 +3724,7 @@
           <w:szCs w:val="24"/>
           <w:vertAlign w:val="superscript"/>
         </w:rPr>
-        <w:t xml:space="preserve">15</w:t>
+        <w:t xml:space="preserve">17</w:t>
       </w:r>
       <w:r>
         <w:rPr>
@@ -3900,71 +3917,71 @@
           <w:szCs w:val="24"/>
           <w:vertAlign w:val="superscript"/>
         </w:rPr>
+        <w:t xml:space="preserve">18</w:t>
+      </w:r>
+      <w:r>
+        <w:rPr>
+          <w:rFonts w:ascii="Times New Roman" w:cs="Times New Roman" w:eastAsia="Times New Roman" w:hAnsi="Times New Roman"/>
+          <w:sz w:val="24"/>
+          <w:szCs w:val="24"/>
+        </w:rPr>
+        <w:t xml:space="preserve"> Delays have also been shown to build up over an operating list as the scheduled time before each case grows.</w:t>
+      </w:r>
+      <w:r>
+        <w:rPr>
+          <w:rFonts w:ascii="Times New Roman" w:cs="Times New Roman" w:eastAsia="Times New Roman" w:hAnsi="Times New Roman"/>
+          <w:sz w:val="24"/>
+          <w:szCs w:val="24"/>
+          <w:vertAlign w:val="superscript"/>
+        </w:rPr>
+        <w:t xml:space="preserve">19</w:t>
+      </w:r>
+      <w:r>
+        <w:rPr>
+          <w:rFonts w:ascii="Times New Roman" w:cs="Times New Roman" w:eastAsia="Times New Roman" w:hAnsi="Times New Roman"/>
+          <w:sz w:val="24"/>
+          <w:szCs w:val="24"/>
+        </w:rPr>
+        <w:t xml:space="preserve"> Both findings, the estimation biases and the build-up of delay, are consistent with our observation that the rooms hosting long, hard-to-book cases were the rooms that ran late, although the descriptive design cannot test this cumulative mechanism directly.</w:t>
+      </w:r>
+    </w:p>
+    <w:p>
+      <w:pPr>
+        <w:spacing w:after="240" w:line="360"/>
+      </w:pPr>
+      <w:r>
+        <w:rPr>
+          <w:rFonts w:ascii="Times New Roman" w:cs="Times New Roman" w:eastAsia="Times New Roman" w:hAnsi="Times New Roman"/>
+          <w:sz w:val="24"/>
+          <w:szCs w:val="24"/>
+        </w:rPr>
+        <w:t xml:space="preserve">Start-time punctuality, the most widely monitored discipline marker, was uninformative about overtime at this hospital. The premise behind first-case on-time starts is that each minute of tardiness carries through to the end of the day at measurable cost.</w:t>
+      </w:r>
+      <w:r>
+        <w:rPr>
+          <w:rFonts w:ascii="Times New Roman" w:cs="Times New Roman" w:eastAsia="Times New Roman" w:hAnsi="Times New Roman"/>
+          <w:sz w:val="24"/>
+          <w:szCs w:val="24"/>
+          <w:vertAlign w:val="superscript"/>
+        </w:rPr>
+        <w:t xml:space="preserve">15</w:t>
+      </w:r>
+      <w:r>
+        <w:rPr>
+          <w:rFonts w:ascii="Times New Roman" w:cs="Times New Roman" w:eastAsia="Times New Roman" w:hAnsi="Times New Roman"/>
+          <w:sz w:val="24"/>
+          <w:szCs w:val="24"/>
+        </w:rPr>
+        <w:t xml:space="preserve"> That premise did not translate into a room-level association: the correlation between late-start rate and overtime rate was absent, and its direction, if anything, negative. Pandit and colleagues reached a compatible conclusion across more than 7,000 UK operating lists, in which start time explained only 4 to 8% of the variance in finish time.</w:t>
+      </w:r>
+      <w:r>
+        <w:rPr>
+          <w:rFonts w:ascii="Times New Roman" w:cs="Times New Roman" w:eastAsia="Times New Roman" w:hAnsi="Times New Roman"/>
+          <w:sz w:val="24"/>
+          <w:szCs w:val="24"/>
+          <w:vertAlign w:val="superscript"/>
+        </w:rPr>
         <w:t xml:space="preserve">16</w:t>
-      </w:r>
-      <w:r>
-        <w:rPr>
-          <w:rFonts w:ascii="Times New Roman" w:cs="Times New Roman" w:eastAsia="Times New Roman" w:hAnsi="Times New Roman"/>
-          <w:sz w:val="24"/>
-          <w:szCs w:val="24"/>
-        </w:rPr>
-        <w:t xml:space="preserve"> Delays have also been shown to build up over an operating list as the scheduled time before each case grows.</w:t>
-      </w:r>
-      <w:r>
-        <w:rPr>
-          <w:rFonts w:ascii="Times New Roman" w:cs="Times New Roman" w:eastAsia="Times New Roman" w:hAnsi="Times New Roman"/>
-          <w:sz w:val="24"/>
-          <w:szCs w:val="24"/>
-          <w:vertAlign w:val="superscript"/>
-        </w:rPr>
-        <w:t xml:space="preserve">17</w:t>
-      </w:r>
-      <w:r>
-        <w:rPr>
-          <w:rFonts w:ascii="Times New Roman" w:cs="Times New Roman" w:eastAsia="Times New Roman" w:hAnsi="Times New Roman"/>
-          <w:sz w:val="24"/>
-          <w:szCs w:val="24"/>
-        </w:rPr>
-        <w:t xml:space="preserve"> Both findings, the estimation biases and the build-up of delay, are consistent with our observation that the rooms hosting long, hard-to-book cases were the rooms that ran late, although the descriptive design cannot test this cumulative mechanism directly.</w:t>
-      </w:r>
-    </w:p>
-    <w:p>
-      <w:pPr>
-        <w:spacing w:after="240" w:line="360"/>
-      </w:pPr>
-      <w:r>
-        <w:rPr>
-          <w:rFonts w:ascii="Times New Roman" w:cs="Times New Roman" w:eastAsia="Times New Roman" w:hAnsi="Times New Roman"/>
-          <w:sz w:val="24"/>
-          <w:szCs w:val="24"/>
-        </w:rPr>
-        <w:t xml:space="preserve">Start-time punctuality, the most widely monitored discipline marker, was uninformative about overtime at this hospital. The premise behind first-case on-time starts is that each minute of tardiness carries through to the end of the day at measurable cost.</w:t>
-      </w:r>
-      <w:r>
-        <w:rPr>
-          <w:rFonts w:ascii="Times New Roman" w:cs="Times New Roman" w:eastAsia="Times New Roman" w:hAnsi="Times New Roman"/>
-          <w:sz w:val="24"/>
-          <w:szCs w:val="24"/>
-          <w:vertAlign w:val="superscript"/>
-        </w:rPr>
-        <w:t xml:space="preserve">18</w:t>
-      </w:r>
-      <w:r>
-        <w:rPr>
-          <w:rFonts w:ascii="Times New Roman" w:cs="Times New Roman" w:eastAsia="Times New Roman" w:hAnsi="Times New Roman"/>
-          <w:sz w:val="24"/>
-          <w:szCs w:val="24"/>
-        </w:rPr>
-        <w:t xml:space="preserve"> That premise did not translate into a room-level association: the correlation between late-start rate and overtime rate was absent, and its direction, if anything, negative. Pandit and colleagues reached a compatible conclusion across more than 7,000 UK operating lists, in which start time explained only 4 to 8% of the variance in finish time.</w:t>
-      </w:r>
-      <w:r>
-        <w:rPr>
-          <w:rFonts w:ascii="Times New Roman" w:cs="Times New Roman" w:eastAsia="Times New Roman" w:hAnsi="Times New Roman"/>
-          <w:sz w:val="24"/>
-          <w:szCs w:val="24"/>
-          <w:vertAlign w:val="superscript"/>
-        </w:rPr>
-        <w:t xml:space="preserve">19</w:t>
       </w:r>
       <w:r>
         <w:rPr>
@@ -4471,7 +4488,7 @@
           <w:sz w:val="24"/>
           <w:szCs w:val="24"/>
         </w:rPr>
-        <w:t xml:space="preserve">11. Zhang C, Dunstan C, Pandit JJ. A tutorial on "capped utilisation" as a metric and key performance target in NHS England’s Model Hospital operating theatres database: caution for international healthcare systems. Anesthesiol Perioper Sci 2024. DOI: 10.1007/s44254-024-00073-3.</w:t>
+        <w:t xml:space="preserve">11. Zhang C, Dunstan C, Pandit JJ. A tutorial on "capped utilisation" as a metric and key performance target in NHS England’s Model Hospital operating theatres database: caution for international healthcare systems. Anesthesiol Perioper Sci 2024;2:35. DOI: 10.1007/s44254-024-00073-3.</w:t>
       </w:r>
     </w:p>
     <w:p>
@@ -4523,59 +4540,59 @@
           <w:sz w:val="24"/>
           <w:szCs w:val="24"/>
         </w:rPr>
-        <w:t xml:space="preserve">15. MacMillan L, Madura GM, Elliot M, et al. What affects operating room turnover time? A systematic review and mapping of the evidence. Surgery 2025;181:109263.</w:t>
-      </w:r>
-    </w:p>
-    <w:p>
-      <w:pPr>
-        <w:spacing w:after="240" w:line="360"/>
-      </w:pPr>
-      <w:r>
-        <w:rPr>
-          <w:rFonts w:ascii="Times New Roman" w:cs="Times New Roman" w:eastAsia="Times New Roman" w:hAnsi="Times New Roman"/>
-          <w:sz w:val="24"/>
-          <w:szCs w:val="24"/>
-        </w:rPr>
-        <w:t xml:space="preserve">16. Fügener A, Schiffels S, Kolisch R. Overutilization and underutilization of operating rooms: insights from behavioral health care operations management. Health Care Manag Sci 2017;20(1):115-28.</w:t>
-      </w:r>
-    </w:p>
-    <w:p>
-      <w:pPr>
-        <w:spacing w:after="240" w:line="360"/>
-      </w:pPr>
-      <w:r>
-        <w:rPr>
-          <w:rFonts w:ascii="Times New Roman" w:cs="Times New Roman" w:eastAsia="Times New Roman" w:hAnsi="Times New Roman"/>
-          <w:sz w:val="24"/>
-          <w:szCs w:val="24"/>
-        </w:rPr>
-        <w:t xml:space="preserve">17. Wachtel RE, Dexter F. Influence of the operating room schedule on tardiness from scheduled start times. Anesth Analg 2009;108(6):1889-901.</w:t>
-      </w:r>
-    </w:p>
-    <w:p>
-      <w:pPr>
-        <w:spacing w:after="240" w:line="360"/>
-      </w:pPr>
-      <w:r>
-        <w:rPr>
-          <w:rFonts w:ascii="Times New Roman" w:cs="Times New Roman" w:eastAsia="Times New Roman" w:hAnsi="Times New Roman"/>
-          <w:sz w:val="24"/>
-          <w:szCs w:val="24"/>
-        </w:rPr>
-        <w:t xml:space="preserve">18. Dexter F, Epstein RH. Typical savings from each minute reduction in tardy first case of the day starts. Anesth Analg 2009;108(4):1262-7.</w:t>
-      </w:r>
-    </w:p>
-    <w:p>
-      <w:pPr>
-        <w:spacing w:after="240" w:line="360"/>
-      </w:pPr>
-      <w:r>
-        <w:rPr>
-          <w:rFonts w:ascii="Times New Roman" w:cs="Times New Roman" w:eastAsia="Times New Roman" w:hAnsi="Times New Roman"/>
-          <w:sz w:val="24"/>
-          <w:szCs w:val="24"/>
-        </w:rPr>
-        <w:t xml:space="preserve">19. Pandit JJ, Abbott T, Pandit M, et al. Is "starting on time" useful (or useless) as a surrogate measure for "surgical theatre efficiency"? Anaesthesia 2012;67(8):823-32.</w:t>
+        <w:t xml:space="preserve">15. Dexter F, Epstein RH. Typical savings from each minute reduction in tardy first case of the day starts. Anesth Analg 2009;108(4):1262-7.</w:t>
+      </w:r>
+    </w:p>
+    <w:p>
+      <w:pPr>
+        <w:spacing w:after="240" w:line="360"/>
+      </w:pPr>
+      <w:r>
+        <w:rPr>
+          <w:rFonts w:ascii="Times New Roman" w:cs="Times New Roman" w:eastAsia="Times New Roman" w:hAnsi="Times New Roman"/>
+          <w:sz w:val="24"/>
+          <w:szCs w:val="24"/>
+        </w:rPr>
+        <w:t xml:space="preserve">16. Pandit JJ, Abbott T, Pandit M, et al. Is "starting on time" useful (or useless) as a surrogate measure for "surgical theatre efficiency"? Anaesthesia 2012;67(8):823-32.</w:t>
+      </w:r>
+    </w:p>
+    <w:p>
+      <w:pPr>
+        <w:spacing w:after="240" w:line="360"/>
+      </w:pPr>
+      <w:r>
+        <w:rPr>
+          <w:rFonts w:ascii="Times New Roman" w:cs="Times New Roman" w:eastAsia="Times New Roman" w:hAnsi="Times New Roman"/>
+          <w:sz w:val="24"/>
+          <w:szCs w:val="24"/>
+        </w:rPr>
+        <w:t xml:space="preserve">17. MacMillan L, Madura GM, Elliot M, et al. What affects operating room turnover time? A systematic review and mapping of the evidence. Surgery 2025;181:109263.</w:t>
+      </w:r>
+    </w:p>
+    <w:p>
+      <w:pPr>
+        <w:spacing w:after="240" w:line="360"/>
+      </w:pPr>
+      <w:r>
+        <w:rPr>
+          <w:rFonts w:ascii="Times New Roman" w:cs="Times New Roman" w:eastAsia="Times New Roman" w:hAnsi="Times New Roman"/>
+          <w:sz w:val="24"/>
+          <w:szCs w:val="24"/>
+        </w:rPr>
+        <w:t xml:space="preserve">18. Fügener A, Schiffels S, Kolisch R. Overutilization and underutilization of operating rooms: insights from behavioral health care operations management. Health Care Manag Sci 2017;20(1):115-28.</w:t>
+      </w:r>
+    </w:p>
+    <w:p>
+      <w:pPr>
+        <w:spacing w:after="240" w:line="360"/>
+      </w:pPr>
+      <w:r>
+        <w:rPr>
+          <w:rFonts w:ascii="Times New Roman" w:cs="Times New Roman" w:eastAsia="Times New Roman" w:hAnsi="Times New Roman"/>
+          <w:sz w:val="24"/>
+          <w:szCs w:val="24"/>
+        </w:rPr>
+        <w:t xml:space="preserve">19. Wachtel RE, Dexter F. Influence of the operating room schedule on tardiness from scheduled start times. Anesth Analg 2009;108(6):1889-901.</w:t>
       </w:r>
     </w:p>
     <w:p>
@@ -4640,7 +4657,7 @@
           <w:sz w:val="24"/>
           <w:szCs w:val="24"/>
         </w:rPr>
-        <w:t xml:space="preserve">24. Ivers N, Jamtvedt G, Flottorp S, et al. Audit and feedback: effects on professional practice and healthcare outcomes. Cochrane Database Syst Rev 2012;(6):CD000259.</w:t>
+        <w:t xml:space="preserve">24. Ivers N, Jamtvedt G, Flottorp S, et al. Audit and feedback: effects on professional practice and healthcare outcomes. Cochrane Database Syst Rev 2012;2012(6):CD000259.</w:t>
       </w:r>
     </w:p>
     <w:p>

</xml_diff>

<commit_message>
Apply the eight read-through fixes to the master manuscript
Concrete terminology rationale, compressed reclassification sentence,
labelled planning-accuracy numbers, case-level scope on the unmeasured
overlap link, removal of the internal clinical-team clause, exact room
composition percentages, source-faithful Ivers wording, and Limitations
aligned with the corrected Methods analysis statement.

Co-Authored-By: Claude Fable 5 <noreply@anthropic.com>
Claude-Session: https://claude.ai/code/session_019Qs9REES3rR8WHYJGTAhnJ
</commit_message>
<xml_diff>
--- a/paper/bmjqs_v2_overtime/Manuscript_v3_final.docx
+++ b/paper/bmjqs_v2_overtime/Manuscript_v3_final.docx
@@ -2277,20 +2277,20 @@
           <w:sz w:val="24"/>
           <w:szCs w:val="24"/>
         </w:rPr>
-        <w:t xml:space="preserve"> This study uses the roster as the reference point, applied at room level, because the change of nursing staff at each shift end is the operational event that makes a late-running case consequential at this site.</w:t>
-      </w:r>
-    </w:p>
-    <w:p>
-      <w:pPr>
-        <w:spacing w:after="240" w:line="360"/>
-      </w:pPr>
-      <w:r>
-        <w:rPr>
-          <w:rFonts w:ascii="Times New Roman" w:cs="Times New Roman" w:eastAsia="Times New Roman" w:hAnsi="Times New Roman"/>
-          <w:sz w:val="24"/>
-          <w:szCs w:val="24"/>
-        </w:rPr>
-        <w:t xml:space="preserve">Each case was assigned to a shift by its actual room-in time, following the hospital’s shift boundaries: day (08:00 to 16:30), evening (16:30 to 22:00), and night (22:00 to 08:00). One reclassification was applied: cases entering the room between 07:30 and 08:00 and remaining past 08:00 (n = 6,153) were treated as day-shift cases, since these are early starts of the day programme rather than night activity. The same rules were applied on weekends. A case was flagged as overtime if its room-out fell after the end of its assigned shift, and its overtime minutes equal the positive difference between room-out and shift end. A case was classified as a scheduled crossing when its planned end time already fell after the end of its planned shift; overtime cases that were not scheduled crossings are referred to as unplanned overruns.</w:t>
+        <w:t xml:space="preserve"> This study uses the roster as the reference point, applied at room level: at this hospital, the shift end is when the nursing team changes and the number of staffed rooms falls, so that is the line a late-running case actually crosses.</w:t>
+      </w:r>
+    </w:p>
+    <w:p>
+      <w:pPr>
+        <w:spacing w:after="240" w:line="360"/>
+      </w:pPr>
+      <w:r>
+        <w:rPr>
+          <w:rFonts w:ascii="Times New Roman" w:cs="Times New Roman" w:eastAsia="Times New Roman" w:hAnsi="Times New Roman"/>
+          <w:sz w:val="24"/>
+          <w:szCs w:val="24"/>
+        </w:rPr>
+        <w:t xml:space="preserve">Each case was assigned to a shift by its actual room-in time, following the hospital’s shift boundaries: day (08:00 to 16:30), evening (16:30 to 22:00), and night (22:00 to 08:00). Cases entering between 07:30 and 08:00 and remaining past 08:00 (n = 6,153) were assigned to the day shift, as early starts of the day programme. The same rules applied on weekends. A case was flagged as overtime if its room-out fell after the end of its assigned shift, and its overtime minutes equal the positive difference between room-out and shift end. A case was classified as a scheduled crossing when its planned end time already fell after the end of its planned shift; overtime cases that were not scheduled crossings are referred to as unplanned overruns.</w:t>
       </w:r>
     </w:p>
     <w:p>
@@ -2622,7 +2622,7 @@
           <w:sz w:val="24"/>
           <w:szCs w:val="24"/>
         </w:rPr>
-        <w:t xml:space="preserve">For the unplanned component of overtime, lists that were planned to finish inside the shift but did not, the first candidate explanation is systematic underbooking: if cases routinely needed more time than the schedule allotted, the shortfall would accumulate over a list and push its end past the boundary. The data show no such pattern. Cases were almost as likely to run long as to run short (45.7% versus 54.3% of all cases), and the typical deviation was similar in both directions (median 14 minutes when longer than planned, 12 minutes when shorter). The schedule’s weakness is not bias but unpredictability: two cases booked for the same duration often finished far apart.</w:t>
+        <w:t xml:space="preserve">For the unplanned component of overtime, lists that were planned to finish inside the shift but did not, the first candidate explanation is systematic underbooking: if cases routinely needed more time than the schedule allotted, the shortfall would accumulate over a list and push its end past the boundary. The data show no such pattern. Of all cases, 45.7% ran longer than booked and 54.3% ran shorter, and the typical miss was nearly the same size on both sides: a median of 14 minutes over when a case ran long, and 12 minutes under when it ran short. The schedule’s weakness is not bias but unpredictability: two cases booked for the same duration often finished far apart.</w:t>
       </w:r>
     </w:p>
     <w:p>
@@ -2658,7 +2658,7 @@
           <w:sz w:val="24"/>
           <w:szCs w:val="24"/>
         </w:rPr>
-        <w:t xml:space="preserve">Urgent cases related to overtime through two channels. Directly, they generated it: urgent cases crossed the shift boundary at more than twice the elective rate (18.2% versus 8.3%, Table 2), and the worst cases ran further past it (P95 of 69 versus 29 minutes); because elective cases outnumber urgent cases six to one, elective work still supplied most of the overtime volume. Indirectly, urgent arrivals compressed the elective day: an urgent case occupied a room planned for elective use on 858 of 1,247 observation days (68.8%), and the affected elective cases started later than unaffected ones. At OR11, the emergency-designated room carrying the highest overlap burden (475 events, 15.2% of its elective cases), the median start delay was 60 minutes with overlap versus 28 minutes without. Whether these later starts translated into additional elective overtime was not measured in this study.</w:t>
+        <w:t xml:space="preserve">Urgent cases related to overtime through two channels. Directly, they generated it: urgent cases crossed the shift boundary at more than twice the elective rate (18.2% versus 8.3%, Table 2), and the worst cases ran further past it (P95 of 69 versus 29 minutes); because elective cases outnumber urgent cases six to one, elective work still supplied most of the overtime volume. Indirectly, urgent arrivals compressed the elective day: an urgent case occupied a room planned for elective use on 858 of 1,247 observation days (68.8%), and the affected elective cases started later than unaffected ones. At OR11, the emergency-designated room carrying the highest overlap burden (475 events, 15.2% of its elective cases), the median start delay was 60 minutes with overlap versus 28 minutes without. Whether the delayed cases themselves went on to run more overtime was not measured in this study.</w:t>
       </w:r>
     </w:p>
     <w:p>
@@ -3878,7 +3878,7 @@
           <w:sz w:val="24"/>
           <w:szCs w:val="24"/>
         </w:rPr>
-        <w:t xml:space="preserve"> Whether the volume of scheduled crossings at this hospital reflects a deliberate policy of using the evening tier could not be determined from administrative data and is a question for the clinical team. What the data do show is that planned and unplanned crossings put the case in the same position: it is completed after the nursing handover and with fewer rooms open either way. The two components nonetheless call for different responses. Scheduled crossings raise a planning and capacity question, namely whether the evening tier is sized for the work booked into it. Unplanned overruns raise a duration-risk question instead: whether the durations of the cases booked into a room can be predicted well enough to plan around. The components also separated by room: four of five overtime cases in the cardiac room were scheduled crossings, while three of four in the emergency-designated room were unplanned overruns (Figure 1), so the lever that matters differs from room to room.</w:t>
+        <w:t xml:space="preserve"> Whether the volume of scheduled crossings at this hospital reflects a deliberate policy of using the evening tier could not be determined from administrative data. What the data do show is that planned and unplanned crossings put the case in the same position: it is completed after the nursing handover and with fewer rooms open either way. The two components nonetheless call for different responses. Scheduled crossings raise a planning and capacity question, namely whether the evening tier is sized for the work booked into it. Unplanned overruns raise a duration-risk question instead: whether the durations of the cases booked into a room can be predicted well enough to plan around. The components also separated by room: 81.5% of overtime cases in the cardiac room were scheduled crossings, while 76.7% in the emergency-designated room were unplanned overruns (Figure 1), so the lever that matters differs from room to room.</w:t>
       </w:r>
     </w:p>
     <w:p>
@@ -4122,7 +4122,7 @@
           <w:sz w:val="24"/>
           <w:szCs w:val="24"/>
         </w:rPr>
-        <w:t xml:space="preserve"> Every quantity used in this study, the room-level rates, the scheduled and unplanned components, and the overtime risk visible at booking, derives from timestamps that OR information systems record in daily operation, so monitoring built on these quantities requires no new data collection. Feeding such data back to the teams involved is itself an evidence-supported improvement strategy, most effective when the feedback is repeated, specific, and linked to targets and action plans.</w:t>
+        <w:t xml:space="preserve"> Every quantity used in this study, the room-level rates, the scheduled and unplanned components, and the overtime risk visible at booking, derives from timestamps that OR information systems record in daily operation, so monitoring built on these quantities requires no new data collection. Feeding such data back to the teams involved is itself an evidence-supported improvement strategy, most effective when the feedback is repeated and linked to explicit targets and an action plan.</w:t>
       </w:r>
       <w:r>
         <w:rPr>
@@ -4161,7 +4161,7 @@
           <w:sz w:val="24"/>
           <w:szCs w:val="24"/>
         </w:rPr>
-        <w:t xml:space="preserve">This study has several limitations. It is a single-site analysis, and the concentration and composition patterns reflect one hospital’s staffing structure and scheduling practice; what may generalise is the approach rather than the numbers. The administrative record contains only room-in and room-out times, so events within a case cannot be examined. The analyses are descriptive by design: associations are reported without causal claims, and the account linking case complexity to inter-case gaps, unpredictable durations, and overtime is an interpretation consistent with the data rather than a tested mechanism; the record contains no procedure-level complexity or risk scores, so case-mix differences between rooms could not be adjusted for. Whether scheduled boundary-crossings reflect deliberate policy could not be determined from these data. Weekend cases were classified with the same shift rules as weekday cases, and weekend staffing patterns were not separately verified. Finally, we did not measure patient or staff outcomes; the harm argument rests on published literature in which effect sizes vary widely and some estimates are contested on grounds of residual confounding.</w:t>
+        <w:t xml:space="preserve">This study has several limitations. It is a single-site analysis, and the concentration and composition patterns reflect one hospital’s staffing structure and scheduling practice; what may generalise is the approach rather than the numbers. The administrative record contains only room-in and room-out times, so events within a case cannot be examined. Beyond two rank correlations, the analyses are descriptive, and associations are reported without causal claims. The account linking case complexity to inter-case gaps, unpredictable durations, and overtime is an interpretation consistent with the data rather than a tested mechanism: the record contains no procedure-level complexity or risk scores, so case-mix differences between rooms could not be formally adjusted for. Whether scheduled boundary-crossings reflect deliberate policy could not be determined from these data. Weekend cases were classified with the same shift rules as weekday cases, and weekend staffing patterns were not separately verified. Finally, we did not measure patient or staff outcomes; the harm argument rests on published literature in which effect sizes vary widely and some estimates are contested on grounds of residual confounding.</w:t>
       </w:r>
       <w:r>
         <w:rPr>

</xml_diff>